<commit_message>
fix(qc): fisik foto-dimensi, reagen dinamis, all-baik preserve baris
</commit_message>
<xml_diff>
--- a/public/master/qc.docx
+++ b/public/master/qc.docx
@@ -186,7 +186,6 @@
               <w:bottom w:val="single" w:sz="4" w:space="0" w:color="auto"/>
               <w:right w:val="single" w:sz="8" w:space="0" w:color="000000"/>
             </w:tcBorders>
-            <w:shd w:val="clear" w:color="auto" w:fill="auto"/>
             <w:noWrap/>
             <w:vAlign w:val="center"/>
             <w:hideMark/>
@@ -224,7 +223,6 @@
               <w:bottom w:val="single" w:sz="4" w:space="0" w:color="auto"/>
               <w:right w:val="single" w:sz="8" w:space="0" w:color="auto"/>
             </w:tcBorders>
-            <w:shd w:val="clear" w:color="auto" w:fill="auto"/>
             <w:noWrap/>
             <w:vAlign w:val="center"/>
             <w:hideMark/>
@@ -285,7 +283,6 @@
               <w:bottom w:val="single" w:sz="4" w:space="0" w:color="auto"/>
               <w:right w:val="single" w:sz="4" w:space="0" w:color="auto"/>
             </w:tcBorders>
-            <w:shd w:val="clear" w:color="auto" w:fill="auto"/>
             <w:noWrap/>
             <w:vAlign w:val="center"/>
             <w:hideMark/>
@@ -323,7 +320,6 @@
               <w:bottom w:val="single" w:sz="4" w:space="0" w:color="auto"/>
               <w:right w:val="single" w:sz="8" w:space="0" w:color="000000"/>
             </w:tcBorders>
-            <w:shd w:val="clear" w:color="auto" w:fill="auto"/>
             <w:vAlign w:val="center"/>
           </w:tcPr>
           <w:p>
@@ -359,6 +355,7 @@
               </w:rPr>
               <w:t>{</w:t>
             </w:r>
+            <w:proofErr w:type="spellStart"/>
             <w:r>
               <w:rPr>
                 <w:rFonts w:ascii="Arial" w:eastAsia="Times New Roman" w:hAnsi="Arial"/>
@@ -370,6 +367,7 @@
               </w:rPr>
               <w:t>tgl</w:t>
             </w:r>
+            <w:proofErr w:type="spellEnd"/>
             <w:r>
               <w:rPr>
                 <w:rFonts w:ascii="Arial" w:eastAsia="Times New Roman" w:hAnsi="Arial"/>
@@ -397,7 +395,6 @@
               <w:bottom w:val="single" w:sz="4" w:space="0" w:color="auto"/>
               <w:right w:val="single" w:sz="8" w:space="0" w:color="000000"/>
             </w:tcBorders>
-            <w:shd w:val="clear" w:color="auto" w:fill="auto"/>
             <w:noWrap/>
             <w:vAlign w:val="center"/>
             <w:hideMark/>
@@ -435,7 +432,6 @@
               <w:bottom w:val="nil"/>
               <w:right w:val="nil"/>
             </w:tcBorders>
-            <w:shd w:val="clear" w:color="auto" w:fill="auto"/>
             <w:noWrap/>
             <w:vAlign w:val="center"/>
             <w:hideMark/>
@@ -496,7 +492,6 @@
               <w:bottom w:val="single" w:sz="4" w:space="0" w:color="auto"/>
               <w:right w:val="single" w:sz="4" w:space="0" w:color="auto"/>
             </w:tcBorders>
-            <w:shd w:val="clear" w:color="auto" w:fill="auto"/>
             <w:noWrap/>
             <w:vAlign w:val="center"/>
             <w:hideMark/>
@@ -534,7 +529,6 @@
               <w:bottom w:val="single" w:sz="4" w:space="0" w:color="auto"/>
               <w:right w:val="single" w:sz="8" w:space="0" w:color="000000"/>
             </w:tcBorders>
-            <w:shd w:val="clear" w:color="auto" w:fill="auto"/>
             <w:vAlign w:val="center"/>
           </w:tcPr>
           <w:p>
@@ -608,7 +602,6 @@
               <w:bottom w:val="nil"/>
               <w:right w:val="single" w:sz="8" w:space="0" w:color="000000"/>
             </w:tcBorders>
-            <w:shd w:val="clear" w:color="auto" w:fill="auto"/>
             <w:noWrap/>
             <w:vAlign w:val="center"/>
             <w:hideMark/>
@@ -646,7 +639,6 @@
               <w:bottom w:val="single" w:sz="4" w:space="0" w:color="auto"/>
               <w:right w:val="single" w:sz="8" w:space="0" w:color="auto"/>
             </w:tcBorders>
-            <w:shd w:val="clear" w:color="auto" w:fill="auto"/>
             <w:noWrap/>
             <w:vAlign w:val="center"/>
             <w:hideMark/>
@@ -707,7 +699,6 @@
               <w:bottom w:val="single" w:sz="4" w:space="0" w:color="auto"/>
               <w:right w:val="single" w:sz="4" w:space="0" w:color="auto"/>
             </w:tcBorders>
-            <w:shd w:val="clear" w:color="auto" w:fill="auto"/>
             <w:noWrap/>
             <w:vAlign w:val="center"/>
             <w:hideMark/>
@@ -745,7 +736,6 @@
               <w:bottom w:val="single" w:sz="4" w:space="0" w:color="auto"/>
               <w:right w:val="single" w:sz="8" w:space="0" w:color="000000"/>
             </w:tcBorders>
-            <w:shd w:val="clear" w:color="auto" w:fill="auto"/>
             <w:vAlign w:val="center"/>
           </w:tcPr>
           <w:p>
@@ -788,7 +778,6 @@
               <w:bottom w:val="single" w:sz="8" w:space="0" w:color="auto"/>
               <w:right w:val="single" w:sz="8" w:space="0" w:color="000000"/>
             </w:tcBorders>
-            <w:shd w:val="clear" w:color="auto" w:fill="auto"/>
             <w:noWrap/>
             <w:vAlign w:val="center"/>
             <w:hideMark/>
@@ -839,7 +828,6 @@
               <w:bottom w:val="single" w:sz="8" w:space="0" w:color="auto"/>
               <w:right w:val="nil"/>
             </w:tcBorders>
-            <w:shd w:val="clear" w:color="auto" w:fill="auto"/>
             <w:noWrap/>
             <w:vAlign w:val="center"/>
             <w:hideMark/>
@@ -871,6 +859,7 @@
               </w:rPr>
               <w:t>{</w:t>
             </w:r>
+            <w:proofErr w:type="spellStart"/>
             <w:r>
               <w:rPr>
                 <w:rFonts w:ascii="Arial" w:eastAsia="Times New Roman" w:hAnsi="Arial"/>
@@ -880,6 +869,7 @@
               </w:rPr>
               <w:t>sn_lot</w:t>
             </w:r>
+            <w:proofErr w:type="spellEnd"/>
             <w:r>
               <w:rPr>
                 <w:rFonts w:ascii="Arial" w:eastAsia="Times New Roman" w:hAnsi="Arial"/>
@@ -936,7 +926,6 @@
               <w:bottom w:val="single" w:sz="8" w:space="0" w:color="auto"/>
               <w:right w:val="single" w:sz="4" w:space="0" w:color="auto"/>
             </w:tcBorders>
-            <w:shd w:val="clear" w:color="auto" w:fill="auto"/>
             <w:noWrap/>
             <w:vAlign w:val="center"/>
             <w:hideMark/>
@@ -975,6 +964,7 @@
               </w:rPr>
               <w:t>{</w:t>
             </w:r>
+            <w:proofErr w:type="spellStart"/>
             <w:r>
               <w:rPr>
                 <w:rFonts w:ascii="Arial" w:eastAsia="Times New Roman" w:hAnsi="Arial"/>
@@ -986,6 +976,7 @@
               </w:rPr>
               <w:t>jenis</w:t>
             </w:r>
+            <w:proofErr w:type="spellEnd"/>
             <w:r>
               <w:rPr>
                 <w:rFonts w:ascii="Arial" w:eastAsia="Times New Roman" w:hAnsi="Arial"/>
@@ -1008,7 +999,6 @@
               <w:bottom w:val="single" w:sz="8" w:space="0" w:color="auto"/>
               <w:right w:val="single" w:sz="8" w:space="0" w:color="000000"/>
             </w:tcBorders>
-            <w:shd w:val="clear" w:color="auto" w:fill="auto"/>
             <w:vAlign w:val="center"/>
           </w:tcPr>
           <w:p>
@@ -1038,6 +1028,7 @@
               </w:rPr>
               <w:t>{</w:t>
             </w:r>
+            <w:proofErr w:type="spellStart"/>
             <w:r>
               <w:rPr>
                 <w:rFonts w:ascii="Arial" w:eastAsia="Times New Roman" w:hAnsi="Arial"/>
@@ -1056,6 +1047,7 @@
               </w:rPr>
               <w:t>sebelumnya</w:t>
             </w:r>
+            <w:proofErr w:type="spellEnd"/>
             <w:r>
               <w:rPr>
                 <w:rFonts w:ascii="Arial" w:eastAsia="Times New Roman" w:hAnsi="Arial"/>
@@ -1104,7 +1096,6 @@
               <w:bottom w:val="single" w:sz="8" w:space="0" w:color="000000"/>
               <w:right w:val="single" w:sz="8" w:space="0" w:color="000000"/>
             </w:tcBorders>
-            <w:shd w:val="clear" w:color="auto" w:fill="auto"/>
             <w:noWrap/>
             <w:vAlign w:val="center"/>
             <w:hideMark/>
@@ -1144,7 +1135,6 @@
               <w:bottom w:val="single" w:sz="8" w:space="0" w:color="000000"/>
               <w:right w:val="nil"/>
             </w:tcBorders>
-            <w:shd w:val="clear" w:color="auto" w:fill="auto"/>
             <w:noWrap/>
             <w:vAlign w:val="center"/>
             <w:hideMark/>
@@ -1183,7 +1173,6 @@
               <w:bottom w:val="nil"/>
               <w:right w:val="single" w:sz="8" w:space="0" w:color="auto"/>
             </w:tcBorders>
-            <w:shd w:val="clear" w:color="auto" w:fill="auto"/>
             <w:noWrap/>
             <w:vAlign w:val="center"/>
             <w:hideMark/>
@@ -1223,7 +1212,6 @@
               <w:bottom w:val="single" w:sz="8" w:space="0" w:color="000000"/>
               <w:right w:val="single" w:sz="8" w:space="0" w:color="auto"/>
             </w:tcBorders>
-            <w:shd w:val="clear" w:color="auto" w:fill="auto"/>
             <w:noWrap/>
             <w:vAlign w:val="center"/>
             <w:hideMark/>
@@ -1320,7 +1308,6 @@
               <w:bottom w:val="single" w:sz="8" w:space="0" w:color="auto"/>
               <w:right w:val="single" w:sz="8" w:space="0" w:color="auto"/>
             </w:tcBorders>
-            <w:shd w:val="clear" w:color="auto" w:fill="auto"/>
             <w:noWrap/>
             <w:vAlign w:val="center"/>
             <w:hideMark/>
@@ -1391,7 +1378,6 @@
               <w:bottom w:val="single" w:sz="4" w:space="0" w:color="auto"/>
               <w:right w:val="single" w:sz="8" w:space="0" w:color="000000"/>
             </w:tcBorders>
-            <w:shd w:val="clear" w:color="auto" w:fill="auto"/>
             <w:noWrap/>
             <w:vAlign w:val="center"/>
             <w:hideMark/>
@@ -1442,7 +1428,6 @@
               <w:bottom w:val="nil"/>
               <w:right w:val="single" w:sz="8" w:space="0" w:color="auto"/>
             </w:tcBorders>
-            <w:shd w:val="clear" w:color="auto" w:fill="auto"/>
             <w:noWrap/>
             <w:vAlign w:val="bottom"/>
             <w:hideMark/>
@@ -1476,7 +1461,6 @@
               <w:bottom w:val="nil"/>
               <w:right w:val="single" w:sz="8" w:space="0" w:color="auto"/>
             </w:tcBorders>
-            <w:shd w:val="clear" w:color="auto" w:fill="auto"/>
             <w:noWrap/>
             <w:vAlign w:val="bottom"/>
             <w:hideMark/>
@@ -1514,7 +1498,6 @@
               <w:bottom w:val="single" w:sz="4" w:space="0" w:color="auto"/>
               <w:right w:val="single" w:sz="8" w:space="0" w:color="auto"/>
             </w:tcBorders>
-            <w:shd w:val="clear" w:color="auto" w:fill="auto"/>
             <w:noWrap/>
             <w:vAlign w:val="bottom"/>
             <w:hideMark/>
@@ -1553,7 +1536,6 @@
               <w:bottom w:val="single" w:sz="4" w:space="0" w:color="auto"/>
               <w:right w:val="nil"/>
             </w:tcBorders>
-            <w:shd w:val="clear" w:color="auto" w:fill="auto"/>
             <w:noWrap/>
             <w:vAlign w:val="center"/>
             <w:hideMark/>
@@ -1581,7 +1563,6 @@
               <w:bottom w:val="single" w:sz="4" w:space="0" w:color="auto"/>
               <w:right w:val="single" w:sz="8" w:space="0" w:color="000000"/>
             </w:tcBorders>
-            <w:shd w:val="clear" w:color="auto" w:fill="auto"/>
             <w:noWrap/>
             <w:vAlign w:val="center"/>
             <w:hideMark/>
@@ -1600,14 +1581,45 @@
                 <w:szCs w:val="22"/>
               </w:rPr>
             </w:pPr>
-            <w:r>
-              <w:rPr>
-                <w:rFonts w:ascii="Arial" w:eastAsia="Times New Roman" w:hAnsi="Arial"/>
-                <w:color w:val="000000"/>
-                <w:sz w:val="22"/>
-                <w:szCs w:val="22"/>
-              </w:rPr>
-              <w:t xml:space="preserve">Kondisi Fisik </w:t>
+            <w:proofErr w:type="spellStart"/>
+            <w:r>
+              <w:rPr>
+                <w:rFonts w:ascii="Arial" w:eastAsia="Times New Roman" w:hAnsi="Arial"/>
+                <w:color w:val="000000"/>
+                <w:sz w:val="22"/>
+                <w:szCs w:val="22"/>
+              </w:rPr>
+              <w:t>Kondisi</w:t>
+            </w:r>
+            <w:proofErr w:type="spellEnd"/>
+            <w:r>
+              <w:rPr>
+                <w:rFonts w:ascii="Arial" w:eastAsia="Times New Roman" w:hAnsi="Arial"/>
+                <w:color w:val="000000"/>
+                <w:sz w:val="22"/>
+                <w:szCs w:val="22"/>
+              </w:rPr>
+              <w:t xml:space="preserve"> </w:t>
+            </w:r>
+            <w:proofErr w:type="spellStart"/>
+            <w:r>
+              <w:rPr>
+                <w:rFonts w:ascii="Arial" w:eastAsia="Times New Roman" w:hAnsi="Arial"/>
+                <w:color w:val="000000"/>
+                <w:sz w:val="22"/>
+                <w:szCs w:val="22"/>
+              </w:rPr>
+              <w:t>Fisik</w:t>
+            </w:r>
+            <w:proofErr w:type="spellEnd"/>
+            <w:r>
+              <w:rPr>
+                <w:rFonts w:ascii="Arial" w:eastAsia="Times New Roman" w:hAnsi="Arial"/>
+                <w:color w:val="000000"/>
+                <w:sz w:val="22"/>
+                <w:szCs w:val="22"/>
+              </w:rPr>
+              <w:t xml:space="preserve"> </w:t>
             </w:r>
           </w:p>
         </w:tc>
@@ -1620,7 +1632,6 @@
               <w:bottom w:val="nil"/>
               <w:right w:val="single" w:sz="8" w:space="0" w:color="auto"/>
             </w:tcBorders>
-            <w:shd w:val="clear" w:color="auto" w:fill="auto"/>
             <w:noWrap/>
             <w:vAlign w:val="center"/>
             <w:hideMark/>
@@ -1659,7 +1670,6 @@
               <w:bottom w:val="single" w:sz="4" w:space="0" w:color="auto"/>
               <w:right w:val="single" w:sz="8" w:space="0" w:color="auto"/>
             </w:tcBorders>
-            <w:shd w:val="clear" w:color="auto" w:fill="auto"/>
             <w:noWrap/>
             <w:vAlign w:val="center"/>
             <w:hideMark/>
@@ -1720,7 +1730,6 @@
               <w:bottom w:val="single" w:sz="4" w:space="0" w:color="auto"/>
               <w:right w:val="single" w:sz="8" w:space="0" w:color="auto"/>
             </w:tcBorders>
-            <w:shd w:val="clear" w:color="auto" w:fill="auto"/>
             <w:noWrap/>
             <w:vAlign w:val="center"/>
             <w:hideMark/>
@@ -1777,7 +1786,6 @@
               <w:bottom w:val="single" w:sz="4" w:space="0" w:color="auto"/>
               <w:right w:val="nil"/>
             </w:tcBorders>
-            <w:shd w:val="clear" w:color="auto" w:fill="auto"/>
             <w:noWrap/>
             <w:vAlign w:val="center"/>
             <w:hideMark/>
@@ -1805,7 +1813,6 @@
               <w:bottom w:val="single" w:sz="4" w:space="0" w:color="auto"/>
               <w:right w:val="single" w:sz="8" w:space="0" w:color="000000"/>
             </w:tcBorders>
-            <w:shd w:val="clear" w:color="auto" w:fill="auto"/>
             <w:noWrap/>
             <w:vAlign w:val="center"/>
             <w:hideMark/>
@@ -1846,7 +1853,6 @@
               <w:bottom w:val="nil"/>
               <w:right w:val="single" w:sz="8" w:space="0" w:color="auto"/>
             </w:tcBorders>
-            <w:shd w:val="clear" w:color="auto" w:fill="auto"/>
             <w:noWrap/>
             <w:vAlign w:val="center"/>
             <w:hideMark/>
@@ -1886,7 +1892,6 @@
               <w:bottom w:val="single" w:sz="4" w:space="0" w:color="auto"/>
               <w:right w:val="single" w:sz="8" w:space="0" w:color="auto"/>
             </w:tcBorders>
-            <w:shd w:val="clear" w:color="auto" w:fill="auto"/>
             <w:noWrap/>
             <w:vAlign w:val="center"/>
             <w:hideMark/>
@@ -1948,7 +1953,6 @@
               <w:bottom w:val="nil"/>
               <w:right w:val="single" w:sz="8" w:space="0" w:color="auto"/>
             </w:tcBorders>
-            <w:shd w:val="clear" w:color="auto" w:fill="auto"/>
             <w:noWrap/>
             <w:vAlign w:val="center"/>
             <w:hideMark/>
@@ -2006,7 +2010,6 @@
               <w:bottom w:val="single" w:sz="4" w:space="0" w:color="auto"/>
               <w:right w:val="nil"/>
             </w:tcBorders>
-            <w:shd w:val="clear" w:color="auto" w:fill="auto"/>
             <w:noWrap/>
             <w:vAlign w:val="center"/>
             <w:hideMark/>
@@ -2034,7 +2037,6 @@
               <w:bottom w:val="single" w:sz="4" w:space="0" w:color="auto"/>
               <w:right w:val="single" w:sz="8" w:space="0" w:color="000000"/>
             </w:tcBorders>
-            <w:shd w:val="clear" w:color="auto" w:fill="auto"/>
             <w:noWrap/>
             <w:vAlign w:val="center"/>
             <w:hideMark/>
@@ -2075,7 +2077,6 @@
               <w:bottom w:val="single" w:sz="4" w:space="0" w:color="auto"/>
               <w:right w:val="single" w:sz="8" w:space="0" w:color="auto"/>
             </w:tcBorders>
-            <w:shd w:val="clear" w:color="auto" w:fill="auto"/>
             <w:noWrap/>
             <w:vAlign w:val="center"/>
             <w:hideMark/>
@@ -2115,7 +2116,6 @@
               <w:bottom w:val="single" w:sz="4" w:space="0" w:color="auto"/>
               <w:right w:val="single" w:sz="8" w:space="0" w:color="auto"/>
             </w:tcBorders>
-            <w:shd w:val="clear" w:color="auto" w:fill="auto"/>
             <w:noWrap/>
             <w:vAlign w:val="center"/>
             <w:hideMark/>
@@ -2177,7 +2177,6 @@
               <w:bottom w:val="single" w:sz="4" w:space="0" w:color="auto"/>
               <w:right w:val="single" w:sz="8" w:space="0" w:color="auto"/>
             </w:tcBorders>
-            <w:shd w:val="clear" w:color="auto" w:fill="auto"/>
             <w:noWrap/>
             <w:vAlign w:val="center"/>
             <w:hideMark/>
@@ -2235,7 +2234,6 @@
               <w:bottom w:val="single" w:sz="4" w:space="0" w:color="auto"/>
               <w:right w:val="nil"/>
             </w:tcBorders>
-            <w:shd w:val="clear" w:color="auto" w:fill="auto"/>
             <w:noWrap/>
             <w:vAlign w:val="center"/>
             <w:hideMark/>
@@ -2263,7 +2261,6 @@
               <w:bottom w:val="single" w:sz="4" w:space="0" w:color="auto"/>
               <w:right w:val="single" w:sz="8" w:space="0" w:color="000000"/>
             </w:tcBorders>
-            <w:shd w:val="clear" w:color="auto" w:fill="auto"/>
             <w:noWrap/>
             <w:vAlign w:val="center"/>
             <w:hideMark/>
@@ -2282,15 +2279,77 @@
                 <w:szCs w:val="22"/>
               </w:rPr>
             </w:pPr>
-            <w:r>
-              <w:rPr>
-                <w:rFonts w:ascii="Arial" w:eastAsia="Times New Roman" w:hAnsi="Arial"/>
-                <w:color w:val="000000"/>
-                <w:sz w:val="22"/>
-                <w:szCs w:val="22"/>
-              </w:rPr>
-              <w:t>Kondisi kardus atau peti</w:t>
-            </w:r>
+            <w:proofErr w:type="spellStart"/>
+            <w:r>
+              <w:rPr>
+                <w:rFonts w:ascii="Arial" w:eastAsia="Times New Roman" w:hAnsi="Arial"/>
+                <w:color w:val="000000"/>
+                <w:sz w:val="22"/>
+                <w:szCs w:val="22"/>
+              </w:rPr>
+              <w:t>Kondisi</w:t>
+            </w:r>
+            <w:proofErr w:type="spellEnd"/>
+            <w:r>
+              <w:rPr>
+                <w:rFonts w:ascii="Arial" w:eastAsia="Times New Roman" w:hAnsi="Arial"/>
+                <w:color w:val="000000"/>
+                <w:sz w:val="22"/>
+                <w:szCs w:val="22"/>
+              </w:rPr>
+              <w:t xml:space="preserve"> </w:t>
+            </w:r>
+            <w:proofErr w:type="spellStart"/>
+            <w:r>
+              <w:rPr>
+                <w:rFonts w:ascii="Arial" w:eastAsia="Times New Roman" w:hAnsi="Arial"/>
+                <w:color w:val="000000"/>
+                <w:sz w:val="22"/>
+                <w:szCs w:val="22"/>
+              </w:rPr>
+              <w:t>kardus</w:t>
+            </w:r>
+            <w:proofErr w:type="spellEnd"/>
+            <w:r>
+              <w:rPr>
+                <w:rFonts w:ascii="Arial" w:eastAsia="Times New Roman" w:hAnsi="Arial"/>
+                <w:color w:val="000000"/>
+                <w:sz w:val="22"/>
+                <w:szCs w:val="22"/>
+              </w:rPr>
+              <w:t xml:space="preserve"> </w:t>
+            </w:r>
+            <w:proofErr w:type="spellStart"/>
+            <w:r>
+              <w:rPr>
+                <w:rFonts w:ascii="Arial" w:eastAsia="Times New Roman" w:hAnsi="Arial"/>
+                <w:color w:val="000000"/>
+                <w:sz w:val="22"/>
+                <w:szCs w:val="22"/>
+              </w:rPr>
+              <w:t>atau</w:t>
+            </w:r>
+            <w:proofErr w:type="spellEnd"/>
+            <w:r>
+              <w:rPr>
+                <w:rFonts w:ascii="Arial" w:eastAsia="Times New Roman" w:hAnsi="Arial"/>
+                <w:color w:val="000000"/>
+                <w:sz w:val="22"/>
+                <w:szCs w:val="22"/>
+              </w:rPr>
+              <w:t xml:space="preserve"> </w:t>
+            </w:r>
+            <w:proofErr w:type="spellStart"/>
+            <w:r>
+              <w:rPr>
+                <w:rFonts w:ascii="Arial" w:eastAsia="Times New Roman" w:hAnsi="Arial"/>
+                <w:color w:val="000000"/>
+                <w:sz w:val="22"/>
+                <w:szCs w:val="22"/>
+              </w:rPr>
+              <w:t>peti</w:t>
+            </w:r>
+            <w:proofErr w:type="spellEnd"/>
           </w:p>
         </w:tc>
         <w:tc>
@@ -2302,7 +2361,6 @@
               <w:bottom w:val="nil"/>
               <w:right w:val="single" w:sz="8" w:space="0" w:color="auto"/>
             </w:tcBorders>
-            <w:shd w:val="clear" w:color="auto" w:fill="auto"/>
             <w:noWrap/>
             <w:vAlign w:val="center"/>
             <w:hideMark/>
@@ -2341,7 +2399,6 @@
               <w:bottom w:val="single" w:sz="4" w:space="0" w:color="auto"/>
               <w:right w:val="single" w:sz="8" w:space="0" w:color="auto"/>
             </w:tcBorders>
-            <w:shd w:val="clear" w:color="auto" w:fill="auto"/>
             <w:noWrap/>
             <w:vAlign w:val="center"/>
             <w:hideMark/>
@@ -2402,7 +2459,6 @@
               <w:bottom w:val="single" w:sz="4" w:space="0" w:color="auto"/>
               <w:right w:val="single" w:sz="8" w:space="0" w:color="auto"/>
             </w:tcBorders>
-            <w:shd w:val="clear" w:color="auto" w:fill="auto"/>
             <w:noWrap/>
             <w:vAlign w:val="center"/>
             <w:hideMark/>
@@ -2459,7 +2515,6 @@
               <w:bottom w:val="single" w:sz="8" w:space="0" w:color="auto"/>
               <w:right w:val="nil"/>
             </w:tcBorders>
-            <w:shd w:val="clear" w:color="auto" w:fill="auto"/>
             <w:noWrap/>
             <w:vAlign w:val="center"/>
             <w:hideMark/>
@@ -2494,7 +2549,6 @@
               <w:bottom w:val="single" w:sz="8" w:space="0" w:color="auto"/>
               <w:right w:val="single" w:sz="8" w:space="0" w:color="000000"/>
             </w:tcBorders>
-            <w:shd w:val="clear" w:color="auto" w:fill="auto"/>
             <w:noWrap/>
             <w:vAlign w:val="center"/>
             <w:hideMark/>
@@ -2554,7 +2608,6 @@
               <w:bottom w:val="single" w:sz="8" w:space="0" w:color="auto"/>
               <w:right w:val="single" w:sz="8" w:space="0" w:color="auto"/>
             </w:tcBorders>
-            <w:shd w:val="clear" w:color="auto" w:fill="auto"/>
             <w:noWrap/>
             <w:vAlign w:val="center"/>
             <w:hideMark/>
@@ -2593,7 +2646,6 @@
               <w:bottom w:val="single" w:sz="8" w:space="0" w:color="auto"/>
               <w:right w:val="single" w:sz="8" w:space="0" w:color="auto"/>
             </w:tcBorders>
-            <w:shd w:val="clear" w:color="auto" w:fill="auto"/>
             <w:noWrap/>
             <w:vAlign w:val="center"/>
             <w:hideMark/>
@@ -2654,7 +2706,6 @@
               <w:bottom w:val="single" w:sz="8" w:space="0" w:color="auto"/>
               <w:right w:val="single" w:sz="8" w:space="0" w:color="auto"/>
             </w:tcBorders>
-            <w:shd w:val="clear" w:color="auto" w:fill="auto"/>
             <w:noWrap/>
             <w:vAlign w:val="center"/>
             <w:hideMark/>
@@ -2711,23 +2762,16 @@
               <w:bottom w:val="single" w:sz="8" w:space="0" w:color="auto"/>
               <w:right w:val="nil"/>
             </w:tcBorders>
-            <w:shd w:val="clear" w:color="auto" w:fill="auto"/>
             <w:noWrap/>
             <w:vAlign w:val="center"/>
-            <w:hideMark/>
-          </w:tcPr>
-          <w:p>
-            <w:pPr>
-              <w:numPr>
-                <w:ilvl w:val="0"/>
-                <w:numId w:val="3"/>
-              </w:numPr>
-              <w:rPr>
-                <w:rFonts w:ascii="Arial" w:eastAsia="Times New Roman" w:hAnsi="Arial"/>
-                <w:color w:val="000000"/>
-                <w:sz w:val="22"/>
-                <w:szCs w:val="22"/>
-                <w:lang w:val="id-ID"/>
+          </w:tcPr>
+          <w:p>
+            <w:pPr>
+              <w:rPr>
+                <w:rFonts w:ascii="Arial" w:eastAsia="Times New Roman" w:hAnsi="Arial"/>
+                <w:color w:val="000000"/>
+                <w:sz w:val="22"/>
+                <w:szCs w:val="22"/>
               </w:rPr>
             </w:pPr>
           </w:p>
@@ -2741,10 +2785,8 @@
               <w:bottom w:val="single" w:sz="8" w:space="0" w:color="auto"/>
               <w:right w:val="single" w:sz="8" w:space="0" w:color="000000"/>
             </w:tcBorders>
-            <w:shd w:val="clear" w:color="auto" w:fill="auto"/>
             <w:noWrap/>
             <w:vAlign w:val="center"/>
-            <w:hideMark/>
           </w:tcPr>
           <w:p>
             <w:pPr>
@@ -2782,10 +2824,8 @@
               <w:bottom w:val="single" w:sz="8" w:space="0" w:color="auto"/>
               <w:right w:val="single" w:sz="8" w:space="0" w:color="auto"/>
             </w:tcBorders>
-            <w:shd w:val="clear" w:color="auto" w:fill="auto"/>
             <w:noWrap/>
             <w:vAlign w:val="center"/>
-            <w:hideMark/>
           </w:tcPr>
           <w:p>
             <w:pPr>
@@ -2821,10 +2861,8 @@
               <w:bottom w:val="single" w:sz="8" w:space="0" w:color="auto"/>
               <w:right w:val="single" w:sz="8" w:space="0" w:color="auto"/>
             </w:tcBorders>
-            <w:shd w:val="clear" w:color="auto" w:fill="auto"/>
             <w:noWrap/>
             <w:vAlign w:val="center"/>
-            <w:hideMark/>
           </w:tcPr>
           <w:p>
             <w:pPr>
@@ -2882,23 +2920,386 @@
               <w:bottom w:val="single" w:sz="8" w:space="0" w:color="auto"/>
               <w:right w:val="single" w:sz="8" w:space="0" w:color="auto"/>
             </w:tcBorders>
-            <w:shd w:val="clear" w:color="auto" w:fill="auto"/>
             <w:noWrap/>
             <w:vAlign w:val="center"/>
+          </w:tcPr>
+          <w:p>
+            <w:pPr>
+              <w:rPr>
+                <w:rFonts w:ascii="Arial" w:eastAsia="Times New Roman" w:hAnsi="Arial"/>
+                <w:color w:val="000000"/>
+                <w:sz w:val="22"/>
+                <w:szCs w:val="22"/>
+              </w:rPr>
+            </w:pPr>
+            <w:r>
+              <w:rPr>
+                <w:rFonts w:ascii="Arial" w:eastAsia="Times New Roman" w:hAnsi="Arial"/>
+                <w:color w:val="000000"/>
+                <w:sz w:val="22"/>
+                <w:szCs w:val="22"/>
+              </w:rPr>
+              <w:t>${fisik_</w:t>
+            </w:r>
+            <w:r>
+              <w:rPr>
+                <w:rFonts w:ascii="Arial" w:eastAsia="Times New Roman" w:hAnsi="Arial"/>
+                <w:color w:val="000000"/>
+                <w:sz w:val="22"/>
+                <w:szCs w:val="22"/>
+              </w:rPr>
+              <w:t>5d</w:t>
+            </w:r>
+            <w:r>
+              <w:rPr>
+                <w:rFonts w:ascii="Arial" w:eastAsia="Times New Roman" w:hAnsi="Arial"/>
+                <w:color w:val="000000"/>
+                <w:sz w:val="22"/>
+                <w:szCs w:val="22"/>
+              </w:rPr>
+              <w:t>}</w:t>
+            </w:r>
+          </w:p>
+        </w:tc>
+      </w:tr>
+      <w:tr>
+        <w:trPr>
+          <w:trHeight w:val="327"/>
+        </w:trPr>
+        <w:tc>
+          <w:tcPr>
+            <w:tcW w:w="278" w:type="dxa"/>
+            <w:tcBorders>
+              <w:top w:val="nil"/>
+              <w:left w:val="single" w:sz="8" w:space="0" w:color="auto"/>
+              <w:bottom w:val="single" w:sz="8" w:space="0" w:color="auto"/>
+              <w:right w:val="nil"/>
+            </w:tcBorders>
+            <w:noWrap/>
+            <w:vAlign w:val="center"/>
+          </w:tcPr>
+          <w:p>
+            <w:pPr>
+              <w:rPr>
+                <w:rFonts w:ascii="Arial" w:eastAsia="Times New Roman" w:hAnsi="Arial"/>
+                <w:color w:val="000000"/>
+                <w:sz w:val="22"/>
+                <w:szCs w:val="22"/>
+              </w:rPr>
+            </w:pPr>
+          </w:p>
+        </w:tc>
+        <w:tc>
+          <w:tcPr>
+            <w:tcW w:w="2814" w:type="dxa"/>
+            <w:tcBorders>
+              <w:top w:val="single" w:sz="4" w:space="0" w:color="auto"/>
+              <w:left w:val="nil"/>
+              <w:bottom w:val="single" w:sz="8" w:space="0" w:color="auto"/>
+              <w:right w:val="single" w:sz="8" w:space="0" w:color="000000"/>
+            </w:tcBorders>
+            <w:noWrap/>
+            <w:vAlign w:val="center"/>
+          </w:tcPr>
+          <w:p>
+            <w:pPr>
+              <w:numPr>
+                <w:ilvl w:val="0"/>
+                <w:numId w:val="5"/>
+              </w:numPr>
+              <w:ind w:left="6" w:hanging="142"/>
+              <w:rPr>
+                <w:rFonts w:ascii="Arial" w:eastAsia="Times New Roman" w:hAnsi="Arial"/>
+                <w:color w:val="000000"/>
+                <w:sz w:val="22"/>
+                <w:szCs w:val="22"/>
+                <w:lang w:val="id-ID"/>
+              </w:rPr>
+            </w:pPr>
+            <w:r>
+              <w:rPr>
+                <w:rFonts w:ascii="Arial" w:eastAsia="Times New Roman" w:hAnsi="Arial"/>
+                <w:color w:val="000000"/>
+                <w:sz w:val="22"/>
+                <w:szCs w:val="22"/>
+                <w:lang w:val="id-ID"/>
+              </w:rPr>
+              <w:t>Foto</w:t>
+            </w:r>
+          </w:p>
+        </w:tc>
+        <w:tc>
+          <w:tcPr>
+            <w:tcW w:w="1646" w:type="dxa"/>
+            <w:tcBorders>
+              <w:top w:val="single" w:sz="4" w:space="0" w:color="auto"/>
+              <w:left w:val="nil"/>
+              <w:bottom w:val="single" w:sz="8" w:space="0" w:color="auto"/>
+              <w:right w:val="single" w:sz="8" w:space="0" w:color="auto"/>
+            </w:tcBorders>
+            <w:noWrap/>
+            <w:vAlign w:val="center"/>
+          </w:tcPr>
+          <w:p>
+            <w:pPr>
+              <w:jc w:val="center"/>
+              <w:rPr>
+                <w:rFonts w:ascii="Arial" w:eastAsia="Times New Roman" w:hAnsi="Arial"/>
+                <w:b/>
+                <w:bCs/>
+                <w:color w:val="000000"/>
+                <w:sz w:val="22"/>
+                <w:szCs w:val="22"/>
+              </w:rPr>
+            </w:pPr>
+            <w:r>
+              <w:rPr>
+                <w:rFonts w:ascii="Arial" w:eastAsia="Times New Roman" w:hAnsi="Arial"/>
+                <w:b/>
+                <w:bCs/>
+                <w:color w:val="000000"/>
+                <w:sz w:val="22"/>
+                <w:szCs w:val="22"/>
+              </w:rPr>
+              <w:t>${fisik_</w:t>
+            </w:r>
+            <w:r>
+              <w:rPr>
+                <w:rFonts w:ascii="Arial" w:eastAsia="Times New Roman" w:hAnsi="Arial"/>
+                <w:b/>
+                <w:bCs/>
+                <w:color w:val="000000"/>
+                <w:sz w:val="22"/>
+                <w:szCs w:val="22"/>
+              </w:rPr>
+              <w:t>6</w:t>
+            </w:r>
+            <w:r>
+              <w:rPr>
+                <w:rFonts w:ascii="Arial" w:eastAsia="Times New Roman" w:hAnsi="Arial"/>
+                <w:b/>
+                <w:bCs/>
+                <w:color w:val="000000"/>
+                <w:sz w:val="22"/>
+                <w:szCs w:val="22"/>
+              </w:rPr>
+              <w:t>y}</w:t>
+            </w:r>
+          </w:p>
+        </w:tc>
+        <w:tc>
+          <w:tcPr>
+            <w:tcW w:w="1646" w:type="dxa"/>
+            <w:tcBorders>
+              <w:top w:val="nil"/>
+              <w:left w:val="nil"/>
+              <w:bottom w:val="single" w:sz="8" w:space="0" w:color="auto"/>
+              <w:right w:val="single" w:sz="8" w:space="0" w:color="auto"/>
+            </w:tcBorders>
+            <w:noWrap/>
+            <w:vAlign w:val="center"/>
+          </w:tcPr>
+          <w:p>
+            <w:pPr>
+              <w:jc w:val="center"/>
+              <w:rPr>
+                <w:rFonts w:ascii="Arial" w:eastAsia="Times New Roman" w:hAnsi="Arial"/>
+                <w:b/>
+                <w:bCs/>
+                <w:color w:val="000000"/>
+                <w:sz w:val="22"/>
+                <w:szCs w:val="22"/>
+              </w:rPr>
+            </w:pPr>
+            <w:r>
+              <w:rPr>
+                <w:rFonts w:ascii="Arial" w:eastAsia="Times New Roman" w:hAnsi="Arial"/>
+                <w:b/>
+                <w:bCs/>
+                <w:color w:val="000000"/>
+                <w:sz w:val="22"/>
+                <w:szCs w:val="22"/>
+              </w:rPr>
+              <w:t>${fisik_</w:t>
+            </w:r>
+            <w:r>
+              <w:rPr>
+                <w:rFonts w:ascii="Arial" w:eastAsia="Times New Roman" w:hAnsi="Arial"/>
+                <w:b/>
+                <w:bCs/>
+                <w:color w:val="000000"/>
+                <w:sz w:val="22"/>
+                <w:szCs w:val="22"/>
+              </w:rPr>
+              <w:t>6n</w:t>
+            </w:r>
+            <w:r>
+              <w:rPr>
+                <w:rFonts w:ascii="Arial" w:eastAsia="Times New Roman" w:hAnsi="Arial"/>
+                <w:b/>
+                <w:bCs/>
+                <w:color w:val="000000"/>
+                <w:sz w:val="22"/>
+                <w:szCs w:val="22"/>
+              </w:rPr>
+              <w:t>}</w:t>
+            </w:r>
+          </w:p>
+        </w:tc>
+        <w:tc>
+          <w:tcPr>
+            <w:tcW w:w="3461" w:type="dxa"/>
+            <w:tcBorders>
+              <w:top w:val="nil"/>
+              <w:left w:val="nil"/>
+              <w:bottom w:val="single" w:sz="8" w:space="0" w:color="auto"/>
+              <w:right w:val="single" w:sz="8" w:space="0" w:color="auto"/>
+            </w:tcBorders>
+            <w:noWrap/>
+            <w:vAlign w:val="center"/>
+          </w:tcPr>
+          <w:p>
+            <w:pPr>
+              <w:rPr>
+                <w:rFonts w:ascii="Arial" w:eastAsia="Times New Roman" w:hAnsi="Arial"/>
+                <w:color w:val="000000"/>
+                <w:sz w:val="22"/>
+                <w:szCs w:val="22"/>
+              </w:rPr>
+            </w:pPr>
+            <w:r>
+              <w:rPr>
+                <w:rFonts w:ascii="Arial" w:eastAsia="Times New Roman" w:hAnsi="Arial"/>
+                <w:color w:val="000000"/>
+                <w:sz w:val="22"/>
+                <w:szCs w:val="22"/>
+              </w:rPr>
+              <w:t>${fisik_</w:t>
+            </w:r>
+            <w:r>
+              <w:rPr>
+                <w:rFonts w:ascii="Arial" w:eastAsia="Times New Roman" w:hAnsi="Arial"/>
+                <w:color w:val="000000"/>
+                <w:sz w:val="22"/>
+                <w:szCs w:val="22"/>
+              </w:rPr>
+              <w:t>6d</w:t>
+            </w:r>
+            <w:r>
+              <w:rPr>
+                <w:rFonts w:ascii="Arial" w:eastAsia="Times New Roman" w:hAnsi="Arial"/>
+                <w:color w:val="000000"/>
+                <w:sz w:val="22"/>
+                <w:szCs w:val="22"/>
+              </w:rPr>
+              <w:t>}</w:t>
+            </w:r>
+          </w:p>
+        </w:tc>
+      </w:tr>
+      <w:tr>
+        <w:trPr>
+          <w:trHeight w:val="327"/>
+        </w:trPr>
+        <w:tc>
+          <w:tcPr>
+            <w:tcW w:w="278" w:type="dxa"/>
+            <w:tcBorders>
+              <w:top w:val="nil"/>
+              <w:left w:val="single" w:sz="8" w:space="0" w:color="auto"/>
+              <w:bottom w:val="single" w:sz="8" w:space="0" w:color="auto"/>
+              <w:right w:val="nil"/>
+            </w:tcBorders>
+            <w:noWrap/>
+            <w:vAlign w:val="center"/>
             <w:hideMark/>
           </w:tcPr>
           <w:p>
             <w:pPr>
-              <w:rPr>
-                <w:rFonts w:ascii="Arial" w:eastAsia="Times New Roman" w:hAnsi="Arial"/>
-                <w:color w:val="000000"/>
-                <w:sz w:val="22"/>
-                <w:szCs w:val="22"/>
-              </w:rPr>
-            </w:pPr>
-            <w:r>
-              <w:rPr>
-                <w:rFonts w:ascii="Arial" w:eastAsia="Times New Roman" w:hAnsi="Arial"/>
+              <w:numPr>
+                <w:ilvl w:val="0"/>
+                <w:numId w:val="3"/>
+              </w:numPr>
+              <w:rPr>
+                <w:rFonts w:ascii="Arial" w:eastAsia="Times New Roman" w:hAnsi="Arial"/>
+                <w:color w:val="000000"/>
+                <w:sz w:val="22"/>
+                <w:szCs w:val="22"/>
+                <w:lang w:val="id-ID"/>
+              </w:rPr>
+            </w:pPr>
+          </w:p>
+        </w:tc>
+        <w:tc>
+          <w:tcPr>
+            <w:tcW w:w="2814" w:type="dxa"/>
+            <w:tcBorders>
+              <w:top w:val="single" w:sz="4" w:space="0" w:color="auto"/>
+              <w:left w:val="nil"/>
+              <w:bottom w:val="single" w:sz="8" w:space="0" w:color="auto"/>
+              <w:right w:val="single" w:sz="8" w:space="0" w:color="000000"/>
+            </w:tcBorders>
+            <w:noWrap/>
+            <w:vAlign w:val="center"/>
+            <w:hideMark/>
+          </w:tcPr>
+          <w:p>
+            <w:pPr>
+              <w:numPr>
+                <w:ilvl w:val="0"/>
+                <w:numId w:val="5"/>
+              </w:numPr>
+              <w:ind w:left="6" w:hanging="142"/>
+              <w:rPr>
+                <w:rFonts w:ascii="Arial" w:eastAsia="Times New Roman" w:hAnsi="Arial"/>
+                <w:color w:val="000000"/>
+                <w:sz w:val="22"/>
+                <w:szCs w:val="22"/>
+                <w:lang w:val="id-ID"/>
+              </w:rPr>
+            </w:pPr>
+            <w:r>
+              <w:rPr>
+                <w:rFonts w:ascii="Arial" w:eastAsia="Times New Roman" w:hAnsi="Arial"/>
+                <w:color w:val="000000"/>
+                <w:sz w:val="22"/>
+                <w:szCs w:val="22"/>
+                <w:lang w:val="id-ID"/>
+              </w:rPr>
+              <w:t>Dimensi</w:t>
+            </w:r>
+          </w:p>
+        </w:tc>
+        <w:tc>
+          <w:tcPr>
+            <w:tcW w:w="1646" w:type="dxa"/>
+            <w:tcBorders>
+              <w:top w:val="single" w:sz="4" w:space="0" w:color="auto"/>
+              <w:left w:val="nil"/>
+              <w:bottom w:val="single" w:sz="8" w:space="0" w:color="auto"/>
+              <w:right w:val="single" w:sz="8" w:space="0" w:color="auto"/>
+            </w:tcBorders>
+            <w:noWrap/>
+            <w:vAlign w:val="center"/>
+            <w:hideMark/>
+          </w:tcPr>
+          <w:p>
+            <w:pPr>
+              <w:jc w:val="center"/>
+              <w:rPr>
+                <w:rFonts w:ascii="Arial" w:eastAsia="Times New Roman" w:hAnsi="Arial"/>
+                <w:b/>
+                <w:bCs/>
+                <w:color w:val="000000"/>
+                <w:sz w:val="22"/>
+                <w:szCs w:val="22"/>
+              </w:rPr>
+            </w:pPr>
+            <w:r>
+              <w:rPr>
+                <w:rFonts w:ascii="Arial" w:eastAsia="Times New Roman" w:hAnsi="Arial"/>
+                <w:b/>
+                <w:bCs/>
                 <w:color w:val="000000"/>
                 <w:sz w:val="22"/>
                 <w:szCs w:val="22"/>
@@ -2908,11 +3309,146 @@
             <w:r>
               <w:rPr>
                 <w:rFonts w:ascii="Arial" w:eastAsia="Times New Roman" w:hAnsi="Arial"/>
-                <w:color w:val="000000"/>
-                <w:sz w:val="22"/>
-                <w:szCs w:val="22"/>
-              </w:rPr>
-              <w:t>5d</w:t>
+                <w:b/>
+                <w:bCs/>
+                <w:color w:val="000000"/>
+                <w:sz w:val="22"/>
+                <w:szCs w:val="22"/>
+              </w:rPr>
+              <w:t>7</w:t>
+            </w:r>
+            <w:r>
+              <w:rPr>
+                <w:rFonts w:ascii="Arial" w:eastAsia="Times New Roman" w:hAnsi="Arial"/>
+                <w:b/>
+                <w:bCs/>
+                <w:color w:val="000000"/>
+                <w:sz w:val="22"/>
+                <w:szCs w:val="22"/>
+              </w:rPr>
+              <w:t>y}</w:t>
+            </w:r>
+          </w:p>
+        </w:tc>
+        <w:tc>
+          <w:tcPr>
+            <w:tcW w:w="1646" w:type="dxa"/>
+            <w:tcBorders>
+              <w:top w:val="nil"/>
+              <w:left w:val="nil"/>
+              <w:bottom w:val="single" w:sz="8" w:space="0" w:color="auto"/>
+              <w:right w:val="single" w:sz="8" w:space="0" w:color="auto"/>
+            </w:tcBorders>
+            <w:noWrap/>
+            <w:vAlign w:val="center"/>
+            <w:hideMark/>
+          </w:tcPr>
+          <w:p>
+            <w:pPr>
+              <w:jc w:val="center"/>
+              <w:rPr>
+                <w:rFonts w:ascii="Arial" w:eastAsia="Times New Roman" w:hAnsi="Arial"/>
+                <w:b/>
+                <w:bCs/>
+                <w:color w:val="000000"/>
+                <w:sz w:val="22"/>
+                <w:szCs w:val="22"/>
+              </w:rPr>
+            </w:pPr>
+            <w:r>
+              <w:rPr>
+                <w:rFonts w:ascii="Arial" w:eastAsia="Times New Roman" w:hAnsi="Arial"/>
+                <w:b/>
+                <w:bCs/>
+                <w:color w:val="000000"/>
+                <w:sz w:val="22"/>
+                <w:szCs w:val="22"/>
+              </w:rPr>
+              <w:t>${fisik_</w:t>
+            </w:r>
+            <w:r>
+              <w:rPr>
+                <w:rFonts w:ascii="Arial" w:eastAsia="Times New Roman" w:hAnsi="Arial"/>
+                <w:b/>
+                <w:bCs/>
+                <w:color w:val="000000"/>
+                <w:sz w:val="22"/>
+                <w:szCs w:val="22"/>
+              </w:rPr>
+              <w:t>7</w:t>
+            </w:r>
+            <w:r>
+              <w:rPr>
+                <w:rFonts w:ascii="Arial" w:eastAsia="Times New Roman" w:hAnsi="Arial"/>
+                <w:b/>
+                <w:bCs/>
+                <w:color w:val="000000"/>
+                <w:sz w:val="22"/>
+                <w:szCs w:val="22"/>
+              </w:rPr>
+              <w:t>n</w:t>
+            </w:r>
+            <w:r>
+              <w:rPr>
+                <w:rFonts w:ascii="Arial" w:eastAsia="Times New Roman" w:hAnsi="Arial"/>
+                <w:b/>
+                <w:bCs/>
+                <w:color w:val="000000"/>
+                <w:sz w:val="22"/>
+                <w:szCs w:val="22"/>
+              </w:rPr>
+              <w:t>}</w:t>
+            </w:r>
+          </w:p>
+        </w:tc>
+        <w:tc>
+          <w:tcPr>
+            <w:tcW w:w="3461" w:type="dxa"/>
+            <w:tcBorders>
+              <w:top w:val="nil"/>
+              <w:left w:val="nil"/>
+              <w:bottom w:val="single" w:sz="8" w:space="0" w:color="auto"/>
+              <w:right w:val="single" w:sz="8" w:space="0" w:color="auto"/>
+            </w:tcBorders>
+            <w:noWrap/>
+            <w:vAlign w:val="center"/>
+            <w:hideMark/>
+          </w:tcPr>
+          <w:p>
+            <w:pPr>
+              <w:rPr>
+                <w:rFonts w:ascii="Arial" w:eastAsia="Times New Roman" w:hAnsi="Arial"/>
+                <w:color w:val="000000"/>
+                <w:sz w:val="22"/>
+                <w:szCs w:val="22"/>
+              </w:rPr>
+            </w:pPr>
+            <w:r>
+              <w:rPr>
+                <w:rFonts w:ascii="Arial" w:eastAsia="Times New Roman" w:hAnsi="Arial"/>
+                <w:color w:val="000000"/>
+                <w:sz w:val="22"/>
+                <w:szCs w:val="22"/>
+              </w:rPr>
+              <w:t>${fisik_</w:t>
+            </w:r>
+            <w:r>
+              <w:rPr>
+                <w:rFonts w:ascii="Arial" w:eastAsia="Times New Roman" w:hAnsi="Arial"/>
+                <w:color w:val="000000"/>
+                <w:sz w:val="22"/>
+                <w:szCs w:val="22"/>
+              </w:rPr>
+              <w:t>7</w:t>
+            </w:r>
+            <w:r>
+              <w:rPr>
+                <w:rFonts w:ascii="Arial" w:eastAsia="Times New Roman" w:hAnsi="Arial"/>
+                <w:color w:val="000000"/>
+                <w:sz w:val="22"/>
+                <w:szCs w:val="22"/>
+              </w:rPr>
+              <w:t>d</w:t>
             </w:r>
             <w:r>
               <w:rPr>
@@ -2979,7 +3515,7 @@
       <w:tr>
         <w:tc>
           <w:tcPr>
-            <w:tcW w:w="3085" w:type="dxa"/>
+            <w:tcW w:w="3060" w:type="dxa"/>
             <w:vAlign w:val="center"/>
           </w:tcPr>
           <w:p>
@@ -3008,7 +3544,7 @@
         </w:tc>
         <w:tc>
           <w:tcPr>
-            <w:tcW w:w="1536" w:type="dxa"/>
+            <w:tcW w:w="1599" w:type="dxa"/>
             <w:vAlign w:val="center"/>
           </w:tcPr>
           <w:p>
@@ -3037,7 +3573,7 @@
         </w:tc>
         <w:tc>
           <w:tcPr>
-            <w:tcW w:w="1724" w:type="dxa"/>
+            <w:tcW w:w="1722" w:type="dxa"/>
             <w:vAlign w:val="center"/>
           </w:tcPr>
           <w:p>
@@ -3066,7 +3602,7 @@
         </w:tc>
         <w:tc>
           <w:tcPr>
-            <w:tcW w:w="3544" w:type="dxa"/>
+            <w:tcW w:w="3508" w:type="dxa"/>
             <w:vAlign w:val="center"/>
           </w:tcPr>
           <w:p>
@@ -3097,7 +3633,7 @@
       <w:tr>
         <w:tc>
           <w:tcPr>
-            <w:tcW w:w="3085" w:type="dxa"/>
+            <w:tcW w:w="3060" w:type="dxa"/>
             <w:vAlign w:val="center"/>
           </w:tcPr>
           <w:p>
@@ -3174,7 +3710,7 @@
         </w:tc>
         <w:tc>
           <w:tcPr>
-            <w:tcW w:w="1536" w:type="dxa"/>
+            <w:tcW w:w="1599" w:type="dxa"/>
           </w:tcPr>
           <w:p>
             <w:pPr>
@@ -3191,7 +3727,7 @@
         </w:tc>
         <w:tc>
           <w:tcPr>
-            <w:tcW w:w="1724" w:type="dxa"/>
+            <w:tcW w:w="1722" w:type="dxa"/>
           </w:tcPr>
           <w:p>
             <w:pPr>
@@ -3208,7 +3744,7 @@
         </w:tc>
         <w:tc>
           <w:tcPr>
-            <w:tcW w:w="3544" w:type="dxa"/>
+            <w:tcW w:w="3508" w:type="dxa"/>
           </w:tcPr>
           <w:p>
             <w:pPr>
@@ -3225,7 +3761,7 @@
       <w:tr>
         <w:tc>
           <w:tcPr>
-            <w:tcW w:w="3085" w:type="dxa"/>
+            <w:tcW w:w="3060" w:type="dxa"/>
             <w:vAlign w:val="center"/>
           </w:tcPr>
           <w:p>
@@ -3256,7 +3792,7 @@
         </w:tc>
         <w:tc>
           <w:tcPr>
-            <w:tcW w:w="1536" w:type="dxa"/>
+            <w:tcW w:w="1599" w:type="dxa"/>
           </w:tcPr>
           <w:p>
             <w:pPr>
@@ -3273,7 +3809,7 @@
         </w:tc>
         <w:tc>
           <w:tcPr>
-            <w:tcW w:w="1724" w:type="dxa"/>
+            <w:tcW w:w="1722" w:type="dxa"/>
           </w:tcPr>
           <w:p>
             <w:pPr>
@@ -3290,7 +3826,7 @@
         </w:tc>
         <w:tc>
           <w:tcPr>
-            <w:tcW w:w="3544" w:type="dxa"/>
+            <w:tcW w:w="3508" w:type="dxa"/>
           </w:tcPr>
           <w:p>
             <w:pPr>
@@ -3307,7 +3843,7 @@
       <w:tr>
         <w:tc>
           <w:tcPr>
-            <w:tcW w:w="3085" w:type="dxa"/>
+            <w:tcW w:w="3060" w:type="dxa"/>
             <w:vAlign w:val="center"/>
           </w:tcPr>
           <w:p>
@@ -3344,7 +3880,7 @@
         </w:tc>
         <w:tc>
           <w:tcPr>
-            <w:tcW w:w="1536" w:type="dxa"/>
+            <w:tcW w:w="1599" w:type="dxa"/>
             <w:vAlign w:val="center"/>
           </w:tcPr>
           <w:p>
@@ -3393,7 +3929,7 @@
         </w:tc>
         <w:tc>
           <w:tcPr>
-            <w:tcW w:w="1724" w:type="dxa"/>
+            <w:tcW w:w="1722" w:type="dxa"/>
             <w:vAlign w:val="center"/>
           </w:tcPr>
           <w:p>
@@ -3442,7 +3978,7 @@
         </w:tc>
         <w:tc>
           <w:tcPr>
-            <w:tcW w:w="3544" w:type="dxa"/>
+            <w:tcW w:w="3508" w:type="dxa"/>
             <w:vAlign w:val="center"/>
           </w:tcPr>
           <w:p>
@@ -3484,7 +4020,7 @@
       <w:tr>
         <w:tc>
           <w:tcPr>
-            <w:tcW w:w="3085" w:type="dxa"/>
+            <w:tcW w:w="3060" w:type="dxa"/>
             <w:vAlign w:val="center"/>
           </w:tcPr>
           <w:p>
@@ -3515,7 +4051,7 @@
         </w:tc>
         <w:tc>
           <w:tcPr>
-            <w:tcW w:w="1536" w:type="dxa"/>
+            <w:tcW w:w="1599" w:type="dxa"/>
             <w:vAlign w:val="center"/>
           </w:tcPr>
           <w:p>
@@ -3534,7 +4070,7 @@
         </w:tc>
         <w:tc>
           <w:tcPr>
-            <w:tcW w:w="1724" w:type="dxa"/>
+            <w:tcW w:w="1722" w:type="dxa"/>
             <w:vAlign w:val="center"/>
           </w:tcPr>
           <w:p>
@@ -3553,7 +4089,7 @@
         </w:tc>
         <w:tc>
           <w:tcPr>
-            <w:tcW w:w="3544" w:type="dxa"/>
+            <w:tcW w:w="3508" w:type="dxa"/>
             <w:vAlign w:val="center"/>
           </w:tcPr>
           <w:p>
@@ -3571,7 +4107,7 @@
       <w:tr>
         <w:tc>
           <w:tcPr>
-            <w:tcW w:w="3085" w:type="dxa"/>
+            <w:tcW w:w="3060" w:type="dxa"/>
             <w:vAlign w:val="center"/>
           </w:tcPr>
           <w:p>
@@ -3605,7 +4141,7 @@
         </w:tc>
         <w:tc>
           <w:tcPr>
-            <w:tcW w:w="1536" w:type="dxa"/>
+            <w:tcW w:w="1599" w:type="dxa"/>
             <w:vAlign w:val="center"/>
           </w:tcPr>
           <w:p>
@@ -3674,7 +4210,7 @@
         </w:tc>
         <w:tc>
           <w:tcPr>
-            <w:tcW w:w="1724" w:type="dxa"/>
+            <w:tcW w:w="1722" w:type="dxa"/>
             <w:vAlign w:val="center"/>
           </w:tcPr>
           <w:p>
@@ -3723,7 +4259,7 @@
         </w:tc>
         <w:tc>
           <w:tcPr>
-            <w:tcW w:w="3544" w:type="dxa"/>
+            <w:tcW w:w="3508" w:type="dxa"/>
             <w:vAlign w:val="center"/>
           </w:tcPr>
           <w:p>
@@ -3765,7 +4301,7 @@
       <w:tr>
         <w:tc>
           <w:tcPr>
-            <w:tcW w:w="3085" w:type="dxa"/>
+            <w:tcW w:w="3060" w:type="dxa"/>
             <w:vAlign w:val="center"/>
           </w:tcPr>
           <w:p>
@@ -3796,7 +4332,7 @@
         </w:tc>
         <w:tc>
           <w:tcPr>
-            <w:tcW w:w="1536" w:type="dxa"/>
+            <w:tcW w:w="1599" w:type="dxa"/>
             <w:vAlign w:val="center"/>
           </w:tcPr>
           <w:p>
@@ -3815,7 +4351,7 @@
         </w:tc>
         <w:tc>
           <w:tcPr>
-            <w:tcW w:w="1724" w:type="dxa"/>
+            <w:tcW w:w="1722" w:type="dxa"/>
             <w:vAlign w:val="center"/>
           </w:tcPr>
           <w:p>
@@ -3834,7 +4370,7 @@
         </w:tc>
         <w:tc>
           <w:tcPr>
-            <w:tcW w:w="3544" w:type="dxa"/>
+            <w:tcW w:w="3508" w:type="dxa"/>
             <w:vAlign w:val="center"/>
           </w:tcPr>
           <w:p>
@@ -3852,7 +4388,7 @@
       <w:tr>
         <w:tc>
           <w:tcPr>
-            <w:tcW w:w="3085" w:type="dxa"/>
+            <w:tcW w:w="3060" w:type="dxa"/>
             <w:vAlign w:val="center"/>
           </w:tcPr>
           <w:p>
@@ -3886,7 +4422,7 @@
         </w:tc>
         <w:tc>
           <w:tcPr>
-            <w:tcW w:w="1536" w:type="dxa"/>
+            <w:tcW w:w="1599" w:type="dxa"/>
             <w:vAlign w:val="center"/>
           </w:tcPr>
           <w:p>
@@ -3955,7 +4491,7 @@
         </w:tc>
         <w:tc>
           <w:tcPr>
-            <w:tcW w:w="1724" w:type="dxa"/>
+            <w:tcW w:w="1722" w:type="dxa"/>
             <w:vAlign w:val="center"/>
           </w:tcPr>
           <w:p>
@@ -4004,7 +4540,7 @@
         </w:tc>
         <w:tc>
           <w:tcPr>
-            <w:tcW w:w="3544" w:type="dxa"/>
+            <w:tcW w:w="3508" w:type="dxa"/>
             <w:vAlign w:val="center"/>
           </w:tcPr>
           <w:p>
@@ -4046,7 +4582,7 @@
       <w:tr>
         <w:tc>
           <w:tcPr>
-            <w:tcW w:w="3085" w:type="dxa"/>
+            <w:tcW w:w="3060" w:type="dxa"/>
             <w:vAlign w:val="center"/>
           </w:tcPr>
           <w:p>
@@ -4080,7 +4616,7 @@
         </w:tc>
         <w:tc>
           <w:tcPr>
-            <w:tcW w:w="1536" w:type="dxa"/>
+            <w:tcW w:w="1599" w:type="dxa"/>
             <w:vAlign w:val="center"/>
           </w:tcPr>
           <w:p>
@@ -4149,7 +4685,7 @@
         </w:tc>
         <w:tc>
           <w:tcPr>
-            <w:tcW w:w="1724" w:type="dxa"/>
+            <w:tcW w:w="1722" w:type="dxa"/>
             <w:vAlign w:val="center"/>
           </w:tcPr>
           <w:p>
@@ -4198,7 +4734,7 @@
         </w:tc>
         <w:tc>
           <w:tcPr>
-            <w:tcW w:w="3544" w:type="dxa"/>
+            <w:tcW w:w="3508" w:type="dxa"/>
             <w:vAlign w:val="center"/>
           </w:tcPr>
           <w:p>
@@ -4240,12 +4776,11 @@
       <w:tr>
         <w:tc>
           <w:tcPr>
-            <w:tcW w:w="3085" w:type="dxa"/>
-            <w:vAlign w:val="center"/>
-          </w:tcPr>
-          <w:p>
-            <w:pPr>
-              <w:ind w:left="284"/>
+            <w:tcW w:w="3060" w:type="dxa"/>
+            <w:vAlign w:val="center"/>
+          </w:tcPr>
+          <w:p>
+            <w:pPr>
               <w:rPr>
                 <w:rFonts w:ascii="Arial" w:eastAsia="Times New Roman" w:hAnsi="Arial"/>
                 <w:bCs/>
@@ -4255,11 +4790,59 @@
                 <w:lang w:val="id-ID"/>
               </w:rPr>
             </w:pPr>
-          </w:p>
-        </w:tc>
-        <w:tc>
-          <w:tcPr>
-            <w:tcW w:w="1536" w:type="dxa"/>
+            <w:r>
+              <w:rPr>
+                <w:rFonts w:ascii="Arial" w:eastAsia="Times New Roman" w:hAnsi="Arial"/>
+                <w:color w:val="000000"/>
+                <w:sz w:val="22"/>
+                <w:szCs w:val="22"/>
+              </w:rPr>
+              <w:t xml:space="preserve">-    </w:t>
+            </w:r>
+            <w:r>
+              <w:rPr>
+                <w:rFonts w:ascii="Arial" w:eastAsia="Times New Roman" w:hAnsi="Arial"/>
+                <w:color w:val="000000"/>
+                <w:sz w:val="22"/>
+                <w:szCs w:val="22"/>
+              </w:rPr>
+              <w:t>${</w:t>
+            </w:r>
+            <w:proofErr w:type="spellStart"/>
+            <w:r>
+              <w:rPr>
+                <w:rFonts w:ascii="Arial" w:eastAsia="Times New Roman" w:hAnsi="Arial"/>
+                <w:color w:val="000000"/>
+                <w:sz w:val="22"/>
+                <w:szCs w:val="22"/>
+              </w:rPr>
+              <w:t>reagen</w:t>
+            </w:r>
+            <w:r>
+              <w:rPr>
+                <w:rFonts w:ascii="Arial" w:eastAsia="Times New Roman" w:hAnsi="Arial"/>
+                <w:color w:val="000000"/>
+                <w:sz w:val="22"/>
+                <w:szCs w:val="22"/>
+              </w:rPr>
+              <w:t>_v</w:t>
+            </w:r>
+            <w:proofErr w:type="spellEnd"/>
+            <w:r>
+              <w:rPr>
+                <w:rFonts w:ascii="Arial" w:eastAsia="Times New Roman" w:hAnsi="Arial"/>
+                <w:color w:val="000000"/>
+                <w:sz w:val="22"/>
+                <w:szCs w:val="22"/>
+              </w:rPr>
+              <w:t>}</w:t>
+            </w:r>
+          </w:p>
+        </w:tc>
+        <w:tc>
+          <w:tcPr>
+            <w:tcW w:w="1599" w:type="dxa"/>
+            <w:vAlign w:val="center"/>
           </w:tcPr>
           <w:p>
             <w:pPr>
@@ -4273,11 +4856,58 @@
                 <w:szCs w:val="22"/>
               </w:rPr>
             </w:pPr>
-          </w:p>
-        </w:tc>
-        <w:tc>
-          <w:tcPr>
-            <w:tcW w:w="1724" w:type="dxa"/>
+            <w:r>
+              <w:rPr>
+                <w:rFonts w:ascii="Arial" w:eastAsia="Times New Roman" w:hAnsi="Arial"/>
+                <w:b/>
+                <w:bCs/>
+                <w:color w:val="000000"/>
+                <w:sz w:val="22"/>
+                <w:szCs w:val="22"/>
+              </w:rPr>
+              <w:t>${</w:t>
+            </w:r>
+            <w:proofErr w:type="spellStart"/>
+            <w:r>
+              <w:rPr>
+                <w:rFonts w:ascii="Arial" w:eastAsia="Times New Roman" w:hAnsi="Arial"/>
+                <w:b/>
+                <w:bCs/>
+                <w:color w:val="000000"/>
+                <w:sz w:val="22"/>
+                <w:szCs w:val="22"/>
+              </w:rPr>
+              <w:t>reagen</w:t>
+            </w:r>
+            <w:r>
+              <w:rPr>
+                <w:rFonts w:ascii="Arial" w:eastAsia="Times New Roman" w:hAnsi="Arial"/>
+                <w:b/>
+                <w:bCs/>
+                <w:color w:val="000000"/>
+                <w:sz w:val="22"/>
+                <w:szCs w:val="22"/>
+              </w:rPr>
+              <w:t>_y</w:t>
+            </w:r>
+            <w:proofErr w:type="spellEnd"/>
+            <w:r>
+              <w:rPr>
+                <w:rFonts w:ascii="Arial" w:eastAsia="Times New Roman" w:hAnsi="Arial"/>
+                <w:b/>
+                <w:bCs/>
+                <w:color w:val="000000"/>
+                <w:sz w:val="22"/>
+                <w:szCs w:val="22"/>
+              </w:rPr>
+              <w:t>}</w:t>
+            </w:r>
+          </w:p>
+        </w:tc>
+        <w:tc>
+          <w:tcPr>
+            <w:tcW w:w="1722" w:type="dxa"/>
+            <w:vAlign w:val="center"/>
           </w:tcPr>
           <w:p>
             <w:pPr>
@@ -4291,11 +4921,58 @@
                 <w:szCs w:val="22"/>
               </w:rPr>
             </w:pPr>
-          </w:p>
-        </w:tc>
-        <w:tc>
-          <w:tcPr>
-            <w:tcW w:w="3544" w:type="dxa"/>
+            <w:r>
+              <w:rPr>
+                <w:rFonts w:ascii="Arial" w:eastAsia="Times New Roman" w:hAnsi="Arial"/>
+                <w:b/>
+                <w:bCs/>
+                <w:color w:val="000000"/>
+                <w:sz w:val="22"/>
+                <w:szCs w:val="22"/>
+              </w:rPr>
+              <w:t>${</w:t>
+            </w:r>
+            <w:proofErr w:type="spellStart"/>
+            <w:r>
+              <w:rPr>
+                <w:rFonts w:ascii="Arial" w:eastAsia="Times New Roman" w:hAnsi="Arial"/>
+                <w:b/>
+                <w:bCs/>
+                <w:color w:val="000000"/>
+                <w:sz w:val="22"/>
+                <w:szCs w:val="22"/>
+              </w:rPr>
+              <w:t>reagen</w:t>
+            </w:r>
+            <w:r>
+              <w:rPr>
+                <w:rFonts w:ascii="Arial" w:eastAsia="Times New Roman" w:hAnsi="Arial"/>
+                <w:b/>
+                <w:bCs/>
+                <w:color w:val="000000"/>
+                <w:sz w:val="22"/>
+                <w:szCs w:val="22"/>
+              </w:rPr>
+              <w:t>_n</w:t>
+            </w:r>
+            <w:proofErr w:type="spellEnd"/>
+            <w:r>
+              <w:rPr>
+                <w:rFonts w:ascii="Arial" w:eastAsia="Times New Roman" w:hAnsi="Arial"/>
+                <w:b/>
+                <w:bCs/>
+                <w:color w:val="000000"/>
+                <w:sz w:val="22"/>
+                <w:szCs w:val="22"/>
+              </w:rPr>
+              <w:t>}</w:t>
+            </w:r>
+          </w:p>
+        </w:tc>
+        <w:tc>
+          <w:tcPr>
+            <w:tcW w:w="3508" w:type="dxa"/>
+            <w:vAlign w:val="center"/>
           </w:tcPr>
           <w:p>
             <w:pPr>
@@ -4306,13 +4983,60 @@
                 <w:szCs w:val="22"/>
               </w:rPr>
             </w:pPr>
+            <w:r>
+              <w:rPr>
+                <w:rFonts w:ascii="Arial" w:eastAsia="Times New Roman" w:hAnsi="Arial"/>
+                <w:color w:val="000000"/>
+                <w:sz w:val="22"/>
+                <w:szCs w:val="22"/>
+              </w:rPr>
+              <w:t>${</w:t>
+            </w:r>
+            <w:proofErr w:type="spellStart"/>
+            <w:r>
+              <w:rPr>
+                <w:rFonts w:ascii="Arial" w:eastAsia="Times New Roman" w:hAnsi="Arial"/>
+                <w:color w:val="000000"/>
+                <w:sz w:val="22"/>
+                <w:szCs w:val="22"/>
+              </w:rPr>
+              <w:t>reagen</w:t>
+            </w:r>
+            <w:r>
+              <w:rPr>
+                <w:rFonts w:ascii="Arial" w:eastAsia="Times New Roman" w:hAnsi="Arial"/>
+                <w:color w:val="000000"/>
+                <w:sz w:val="22"/>
+                <w:szCs w:val="22"/>
+              </w:rPr>
+              <w:t>_d</w:t>
+            </w:r>
+            <w:proofErr w:type="spellEnd"/>
+            <w:r>
+              <w:rPr>
+                <w:rFonts w:ascii="Arial" w:eastAsia="Times New Roman" w:hAnsi="Arial"/>
+                <w:color w:val="000000"/>
+                <w:sz w:val="22"/>
+                <w:szCs w:val="22"/>
+              </w:rPr>
+              <w:t>}</w:t>
+            </w:r>
+            <w:r>
+              <w:rPr>
+                <w:rFonts w:ascii="Arial" w:eastAsia="Times New Roman" w:hAnsi="Arial"/>
+                <w:color w:val="000000"/>
+                <w:sz w:val="22"/>
+                <w:szCs w:val="22"/>
+              </w:rPr>
+              <w:t> </w:t>
+            </w:r>
           </w:p>
         </w:tc>
       </w:tr>
       <w:tr>
         <w:tc>
           <w:tcPr>
-            <w:tcW w:w="3085" w:type="dxa"/>
+            <w:tcW w:w="3060" w:type="dxa"/>
             <w:vAlign w:val="center"/>
           </w:tcPr>
           <w:p>
@@ -4331,7 +5055,7 @@
         </w:tc>
         <w:tc>
           <w:tcPr>
-            <w:tcW w:w="1536" w:type="dxa"/>
+            <w:tcW w:w="1599" w:type="dxa"/>
           </w:tcPr>
           <w:p>
             <w:pPr>
@@ -4348,7 +5072,7 @@
         </w:tc>
         <w:tc>
           <w:tcPr>
-            <w:tcW w:w="1724" w:type="dxa"/>
+            <w:tcW w:w="1722" w:type="dxa"/>
           </w:tcPr>
           <w:p>
             <w:pPr>
@@ -4365,77 +5089,7 @@
         </w:tc>
         <w:tc>
           <w:tcPr>
-            <w:tcW w:w="3544" w:type="dxa"/>
-          </w:tcPr>
-          <w:p>
-            <w:pPr>
-              <w:spacing w:line="276" w:lineRule="auto"/>
-              <w:rPr>
-                <w:rFonts w:ascii="Arial" w:hAnsi="Arial"/>
-                <w:sz w:val="22"/>
-                <w:szCs w:val="22"/>
-              </w:rPr>
-            </w:pPr>
-          </w:p>
-        </w:tc>
-      </w:tr>
-      <w:tr>
-        <w:tc>
-          <w:tcPr>
-            <w:tcW w:w="3085" w:type="dxa"/>
-            <w:vAlign w:val="center"/>
-          </w:tcPr>
-          <w:p>
-            <w:pPr>
-              <w:ind w:left="284"/>
-              <w:rPr>
-                <w:rFonts w:ascii="Arial" w:eastAsia="Times New Roman" w:hAnsi="Arial"/>
-                <w:bCs/>
-                <w:color w:val="000000"/>
-                <w:sz w:val="22"/>
-                <w:szCs w:val="22"/>
-                <w:lang w:val="id-ID"/>
-              </w:rPr>
-            </w:pPr>
-          </w:p>
-        </w:tc>
-        <w:tc>
-          <w:tcPr>
-            <w:tcW w:w="1536" w:type="dxa"/>
-          </w:tcPr>
-          <w:p>
-            <w:pPr>
-              <w:spacing w:line="276" w:lineRule="auto"/>
-              <w:rPr>
-                <w:rFonts w:ascii="Arial" w:hAnsi="Arial"/>
-                <w:b/>
-                <w:bCs/>
-                <w:sz w:val="22"/>
-                <w:szCs w:val="22"/>
-              </w:rPr>
-            </w:pPr>
-          </w:p>
-        </w:tc>
-        <w:tc>
-          <w:tcPr>
-            <w:tcW w:w="1724" w:type="dxa"/>
-          </w:tcPr>
-          <w:p>
-            <w:pPr>
-              <w:spacing w:line="276" w:lineRule="auto"/>
-              <w:rPr>
-                <w:rFonts w:ascii="Arial" w:hAnsi="Arial"/>
-                <w:b/>
-                <w:bCs/>
-                <w:sz w:val="22"/>
-                <w:szCs w:val="22"/>
-              </w:rPr>
-            </w:pPr>
-          </w:p>
-        </w:tc>
-        <w:tc>
-          <w:tcPr>
-            <w:tcW w:w="3544" w:type="dxa"/>
+            <w:tcW w:w="3508" w:type="dxa"/>
           </w:tcPr>
           <w:p>
             <w:pPr>
@@ -4490,27 +5144,6 @@
         </w:rPr>
       </w:pPr>
     </w:p>
-    <w:p>
-      <w:pPr>
-        <w:spacing w:line="276" w:lineRule="auto"/>
-        <w:rPr>
-          <w:rFonts w:ascii="Arial" w:hAnsi="Arial"/>
-          <w:sz w:val="22"/>
-          <w:szCs w:val="22"/>
-          <w:lang w:val="id-ID"/>
-        </w:rPr>
-      </w:pPr>
-    </w:p>
-    <w:p>
-      <w:pPr>
-        <w:spacing w:line="276" w:lineRule="auto"/>
-        <w:rPr>
-          <w:rFonts w:ascii="Arial" w:hAnsi="Arial"/>
-          <w:sz w:val="22"/>
-          <w:szCs w:val="22"/>
-        </w:rPr>
-      </w:pPr>
-    </w:p>
     <w:tbl>
       <w:tblPr>
         <w:tblpPr w:leftFromText="180" w:rightFromText="180" w:vertAnchor="text" w:horzAnchor="margin" w:tblpY="2"/>
@@ -4539,7 +5172,6 @@
               <w:bottom w:val="single" w:sz="8" w:space="0" w:color="000000"/>
               <w:right w:val="nil"/>
             </w:tcBorders>
-            <w:shd w:val="clear" w:color="auto" w:fill="auto"/>
             <w:noWrap/>
             <w:vAlign w:val="center"/>
             <w:hideMark/>
@@ -4565,6 +5197,7 @@
                 <w:sz w:val="22"/>
                 <w:szCs w:val="22"/>
               </w:rPr>
+              <w:lastRenderedPageBreak/>
               <w:t>YANG DIPERIKSA</w:t>
             </w:r>
           </w:p>
@@ -4579,7 +5212,6 @@
               <w:bottom w:val="single" w:sz="8" w:space="0" w:color="000000"/>
               <w:right w:val="single" w:sz="8" w:space="0" w:color="auto"/>
             </w:tcBorders>
-            <w:shd w:val="clear" w:color="auto" w:fill="auto"/>
             <w:noWrap/>
             <w:vAlign w:val="center"/>
             <w:hideMark/>
@@ -4618,7 +5250,6 @@
               <w:bottom w:val="nil"/>
               <w:right w:val="nil"/>
             </w:tcBorders>
-            <w:shd w:val="clear" w:color="auto" w:fill="auto"/>
             <w:noWrap/>
             <w:vAlign w:val="center"/>
             <w:hideMark/>
@@ -4658,7 +5289,6 @@
               <w:bottom w:val="single" w:sz="8" w:space="0" w:color="000000"/>
               <w:right w:val="single" w:sz="8" w:space="0" w:color="auto"/>
             </w:tcBorders>
-            <w:shd w:val="clear" w:color="auto" w:fill="auto"/>
             <w:noWrap/>
             <w:vAlign w:val="center"/>
             <w:hideMark/>
@@ -4755,7 +5385,6 @@
               <w:bottom w:val="single" w:sz="8" w:space="0" w:color="auto"/>
               <w:right w:val="nil"/>
             </w:tcBorders>
-            <w:shd w:val="clear" w:color="auto" w:fill="auto"/>
             <w:noWrap/>
             <w:vAlign w:val="center"/>
             <w:hideMark/>
@@ -4826,7 +5455,6 @@
               <w:bottom w:val="single" w:sz="4" w:space="0" w:color="auto"/>
               <w:right w:val="single" w:sz="8" w:space="0" w:color="000000"/>
             </w:tcBorders>
-            <w:shd w:val="clear" w:color="auto" w:fill="auto"/>
             <w:noWrap/>
             <w:vAlign w:val="center"/>
             <w:hideMark/>
@@ -4864,7 +5492,6 @@
               <w:bottom w:val="single" w:sz="4" w:space="0" w:color="auto"/>
               <w:right w:val="single" w:sz="8" w:space="0" w:color="auto"/>
             </w:tcBorders>
-            <w:shd w:val="clear" w:color="auto" w:fill="auto"/>
             <w:noWrap/>
             <w:vAlign w:val="bottom"/>
             <w:hideMark/>
@@ -4898,7 +5525,6 @@
               <w:bottom w:val="single" w:sz="4" w:space="0" w:color="auto"/>
               <w:right w:val="single" w:sz="8" w:space="0" w:color="auto"/>
             </w:tcBorders>
-            <w:shd w:val="clear" w:color="auto" w:fill="auto"/>
             <w:noWrap/>
             <w:vAlign w:val="bottom"/>
             <w:hideMark/>
@@ -4932,7 +5558,6 @@
               <w:bottom w:val="single" w:sz="4" w:space="0" w:color="auto"/>
               <w:right w:val="single" w:sz="8" w:space="0" w:color="auto"/>
             </w:tcBorders>
-            <w:shd w:val="clear" w:color="auto" w:fill="auto"/>
             <w:noWrap/>
             <w:vAlign w:val="bottom"/>
             <w:hideMark/>
@@ -4971,7 +5596,6 @@
               <w:bottom w:val="single" w:sz="4" w:space="0" w:color="auto"/>
               <w:right w:val="nil"/>
             </w:tcBorders>
-            <w:shd w:val="clear" w:color="auto" w:fill="auto"/>
             <w:noWrap/>
             <w:vAlign w:val="center"/>
             <w:hideMark/>
@@ -5009,7 +5633,6 @@
               <w:bottom w:val="single" w:sz="4" w:space="0" w:color="auto"/>
               <w:right w:val="nil"/>
             </w:tcBorders>
-            <w:shd w:val="clear" w:color="auto" w:fill="auto"/>
             <w:noWrap/>
             <w:vAlign w:val="center"/>
             <w:hideMark/>
@@ -5030,7 +5653,17 @@
                 <w:sz w:val="22"/>
                 <w:szCs w:val="22"/>
               </w:rPr>
-              <w:t>${kel</w:t>
+              <w:t>${</w:t>
+            </w:r>
+            <w:proofErr w:type="spellStart"/>
+            <w:r>
+              <w:rPr>
+                <w:rFonts w:ascii="Arial" w:eastAsia="Times New Roman" w:hAnsi="Arial"/>
+                <w:color w:val="000000"/>
+                <w:sz w:val="22"/>
+                <w:szCs w:val="22"/>
+              </w:rPr>
+              <w:t>kel</w:t>
             </w:r>
             <w:r>
               <w:rPr>
@@ -5041,6 +5674,7 @@
               </w:rPr>
               <w:t>_v</w:t>
             </w:r>
+            <w:proofErr w:type="spellEnd"/>
             <w:r>
               <w:rPr>
                 <w:rFonts w:ascii="Arial" w:eastAsia="Times New Roman" w:hAnsi="Arial"/>
@@ -5061,7 +5695,6 @@
               <w:bottom w:val="single" w:sz="4" w:space="0" w:color="auto"/>
               <w:right w:val="single" w:sz="8" w:space="0" w:color="auto"/>
             </w:tcBorders>
-            <w:shd w:val="clear" w:color="auto" w:fill="auto"/>
             <w:noWrap/>
             <w:vAlign w:val="center"/>
             <w:hideMark/>
@@ -5087,7 +5720,31 @@
                 <w:sz w:val="22"/>
                 <w:szCs w:val="22"/>
               </w:rPr>
-              <w:t>${kel_y}</w:t>
+              <w:t>${</w:t>
+            </w:r>
+            <w:proofErr w:type="spellStart"/>
+            <w:r>
+              <w:rPr>
+                <w:rFonts w:ascii="Arial" w:eastAsia="Times New Roman" w:hAnsi="Arial"/>
+                <w:b/>
+                <w:bCs/>
+                <w:color w:val="000000"/>
+                <w:sz w:val="22"/>
+                <w:szCs w:val="22"/>
+              </w:rPr>
+              <w:t>kel_y</w:t>
+            </w:r>
+            <w:proofErr w:type="spellEnd"/>
+            <w:r>
+              <w:rPr>
+                <w:rFonts w:ascii="Arial" w:eastAsia="Times New Roman" w:hAnsi="Arial"/>
+                <w:b/>
+                <w:bCs/>
+                <w:color w:val="000000"/>
+                <w:sz w:val="22"/>
+                <w:szCs w:val="22"/>
+              </w:rPr>
+              <w:t>}</w:t>
             </w:r>
           </w:p>
         </w:tc>
@@ -5100,7 +5757,6 @@
               <w:bottom w:val="single" w:sz="4" w:space="0" w:color="auto"/>
               <w:right w:val="single" w:sz="8" w:space="0" w:color="auto"/>
             </w:tcBorders>
-            <w:shd w:val="clear" w:color="auto" w:fill="auto"/>
             <w:noWrap/>
             <w:vAlign w:val="center"/>
             <w:hideMark/>
@@ -5126,7 +5782,31 @@
                 <w:sz w:val="22"/>
                 <w:szCs w:val="22"/>
               </w:rPr>
-              <w:t>${kel_n}</w:t>
+              <w:t>${</w:t>
+            </w:r>
+            <w:proofErr w:type="spellStart"/>
+            <w:r>
+              <w:rPr>
+                <w:rFonts w:ascii="Arial" w:eastAsia="Times New Roman" w:hAnsi="Arial"/>
+                <w:b/>
+                <w:bCs/>
+                <w:color w:val="000000"/>
+                <w:sz w:val="22"/>
+                <w:szCs w:val="22"/>
+              </w:rPr>
+              <w:t>kel_n</w:t>
+            </w:r>
+            <w:proofErr w:type="spellEnd"/>
+            <w:r>
+              <w:rPr>
+                <w:rFonts w:ascii="Arial" w:eastAsia="Times New Roman" w:hAnsi="Arial"/>
+                <w:b/>
+                <w:bCs/>
+                <w:color w:val="000000"/>
+                <w:sz w:val="22"/>
+                <w:szCs w:val="22"/>
+              </w:rPr>
+              <w:t>}</w:t>
             </w:r>
           </w:p>
         </w:tc>
@@ -5139,7 +5819,6 @@
               <w:bottom w:val="single" w:sz="4" w:space="0" w:color="auto"/>
               <w:right w:val="single" w:sz="8" w:space="0" w:color="auto"/>
             </w:tcBorders>
-            <w:shd w:val="clear" w:color="auto" w:fill="auto"/>
             <w:noWrap/>
             <w:vAlign w:val="center"/>
             <w:hideMark/>
@@ -5160,7 +5839,27 @@
                 <w:sz w:val="22"/>
                 <w:szCs w:val="22"/>
               </w:rPr>
-              <w:t>${kel_d}</w:t>
+              <w:t>${</w:t>
+            </w:r>
+            <w:proofErr w:type="spellStart"/>
+            <w:r>
+              <w:rPr>
+                <w:rFonts w:ascii="Arial" w:eastAsia="Times New Roman" w:hAnsi="Arial"/>
+                <w:color w:val="000000"/>
+                <w:sz w:val="22"/>
+                <w:szCs w:val="22"/>
+              </w:rPr>
+              <w:t>kel_d</w:t>
+            </w:r>
+            <w:proofErr w:type="spellEnd"/>
+            <w:r>
+              <w:rPr>
+                <w:rFonts w:ascii="Arial" w:eastAsia="Times New Roman" w:hAnsi="Arial"/>
+                <w:color w:val="000000"/>
+                <w:sz w:val="22"/>
+                <w:szCs w:val="22"/>
+              </w:rPr>
+              <w:t>}</w:t>
             </w:r>
             <w:r>
               <w:rPr>
@@ -7122,6 +7821,17 @@
       <w:szCs w:val="18"/>
     </w:rPr>
   </w:style>
+  <w:style w:type="paragraph" w:styleId="ListParagraph">
+    <w:name w:val="List Paragraph"/>
+    <w:basedOn w:val="Normal"/>
+    <w:uiPriority w:val="34"/>
+    <w:qFormat/>
+    <w:rsid w:val="00AA3D9C"/>
+    <w:pPr>
+      <w:ind w:left="720"/>
+      <w:contextualSpacing/>
+    </w:pPr>
+  </w:style>
 </w:styles>
 </file>
 

</xml_diff>